<commit_message>
Add Super Admin role with access to all roles
Design: domain model, high-level requirements, architecture, and
detailed use cases now specify a single Super Admin who has every
other role's permissions and is the sole actor responsible for
onboarding employees and assigning roles. Added a corresponding risk
(Super Admin as a single point of failure) to the risk list. Word
docs regenerated to match.

Implementation: renamed the 'admin' role to 'superadmin' throughout
the backend (schema, seed data, route guards) and frontend, and
replaced the admin stub page with a Super Admin page that can access
both the POS Terminal and Restock views (matching the "access to all
roles" design), plus a placeholder for the deferred employee
onboarding/role-assignment use case.
</commit_message>
<xml_diff>
--- a/docs/word/architecture.docx
+++ b/docs/word/architecture.docx
@@ -94,7 +94,7 @@
       <w:r>
         <w:drawing>
           <wp:inline>
-            <wp:extent cx="5334000" cy="1619250"/>
+            <wp:extent cx="5334000" cy="1598839"/>
             <wp:effectExtent b="0" l="0" r="0" t="0"/>
             <wp:docPr descr="Diagram 1" title="" id="12" name="Picture"/>
             <a:graphic>
@@ -115,7 +115,7 @@
                   <pic:spPr bwMode="auto">
                     <a:xfrm>
                       <a:off x="0" y="0"/>
-                      <a:ext cx="5334000" cy="1619250"/>
+                      <a:ext cx="5334000" cy="1598839"/>
                     </a:xfrm>
                     <a:prstGeom prst="rect">
                       <a:avLst/>
@@ -216,7 +216,7 @@
               <w:pStyle w:val="Compact"/>
             </w:pPr>
             <w:r>
-              <w:t xml:space="preserve">Renders screens per role (Cashier, Manager, Admin); captures input; contains no business rules.</w:t>
+              <w:t xml:space="preserve">Renders screens per role (Cashier, Manager, Super Admin); captures input; contains no business rules.</w:t>
             </w:r>
           </w:p>
         </w:tc>
@@ -407,7 +407,7 @@
         <w:t xml:space="preserve"> </w:t>
       </w:r>
       <w:r>
-        <w:t xml:space="preserve">is addressed by routing all role-sensitive operations (Manager/Admin screens) through</w:t>
+        <w:t xml:space="preserve">is addressed by routing all role-sensitive operations (Manager/Super Admin screens) through</w:t>
       </w:r>
       <w:r>
         <w:t xml:space="preserve"> </w:t>
@@ -423,6 +423,30 @@
       </w:r>
       <w:r>
         <w:t xml:space="preserve">before reaching the Domain layer.</w:t>
+      </w:r>
+      <w:r>
+        <w:t xml:space="preserve"> </w:t>
+      </w:r>
+      <w:r>
+        <w:rPr>
+          <w:rStyle w:val="VerbatimChar"/>
+        </w:rPr>
+        <w:t xml:space="preserve">AuthService</w:t>
+      </w:r>
+      <w:r>
+        <w:t xml:space="preserve"> </w:t>
+      </w:r>
+      <w:r>
+        <w:t xml:space="preserve">grants the Super Admin role every permission granted to Cashier and Store Manager, and reserves employee onboarding/role assignment (</w:t>
+      </w:r>
+      <w:r>
+        <w:rPr>
+          <w:rStyle w:val="VerbatimChar"/>
+        </w:rPr>
+        <w:t xml:space="preserve">EmployeeService</w:t>
+      </w:r>
+      <w:r>
+        <w:t xml:space="preserve">) exclusively for Super Admin.</w:t>
       </w:r>
     </w:p>
     <w:p>

</xml_diff>